<commit_message>
no se que poner
</commit_message>
<xml_diff>
--- a/documenos/practica_29_de_septiembre.docx
+++ b/documenos/practica_29_de_septiembre.docx
@@ -2,7 +2,950 @@
 <file path=word/document.xml><?xml version="1.0" encoding="utf-8"?>
 <w:document xmlns:wpc="http://schemas.microsoft.com/office/word/2010/wordprocessingCanvas" xmlns:cx="http://schemas.microsoft.com/office/drawing/2014/chartex" xmlns:cx1="http://schemas.microsoft.com/office/drawing/2015/9/8/chartex" xmlns:cx2="http://schemas.microsoft.com/office/drawing/2015/10/21/chartex" xmlns:cx3="http://schemas.microsoft.com/office/drawing/2016/5/9/chartex" xmlns:cx4="http://schemas.microsoft.com/office/drawing/2016/5/10/chartex" xmlns:cx5="http://schemas.microsoft.com/office/drawing/2016/5/11/chartex" xmlns:cx6="http://schemas.microsoft.com/office/drawing/2016/5/12/chartex" xmlns:cx7="http://schemas.microsoft.com/office/drawing/2016/5/13/chartex" xmlns:cx8="http://schemas.microsoft.com/office/drawing/2016/5/14/chartex" xmlns:mc="http://schemas.openxmlformats.org/markup-compatibility/2006" xmlns:aink="http://schemas.microsoft.com/office/drawing/2016/ink" xmlns:am3d="http://schemas.microsoft.com/office/drawing/2017/model3d" xmlns:o="urn:schemas-microsoft-com:office:office" xmlns:oel="http://schemas.microsoft.com/office/2019/extlst" xmlns:r="http://schemas.openxmlformats.org/officeDocument/2006/relationships" xmlns:m="http://schemas.openxmlformats.org/officeDocument/2006/math" xmlns:v="urn:schemas-microsoft-com:vml" xmlns:wp14="http://schemas.microsoft.com/office/word/2010/wordprocessingDrawing" xmlns:wp="http://schemas.openxmlformats.org/drawingml/2006/wordprocessingDrawing" xmlns:w10="urn:schemas-microsoft-com:office:word" xmlns:w="http://schemas.openxmlformats.org/wordprocessingml/2006/main" xmlns:w14="http://schemas.microsoft.com/office/word/2010/wordml" xmlns:w15="http://schemas.microsoft.com/office/word/2012/wordml" xmlns:w16cex="http://schemas.microsoft.com/office/word/2018/wordml/cex" xmlns:w16cid="http://schemas.microsoft.com/office/word/2016/wordml/cid" xmlns:w16="http://schemas.microsoft.com/office/word/2018/wordml" xmlns:w16du="http://schemas.microsoft.com/office/word/2023/wordml/word16du" xmlns:w16sdtdh="http://schemas.microsoft.com/office/word/2020/wordml/sdtdatahash" xmlns:w16sdtfl="http://schemas.microsoft.com/office/word/2024/wordml/sdtformatlock" xmlns:w16se="http://schemas.microsoft.com/office/word/2015/wordml/symex" xmlns:wpg="http://schemas.microsoft.com/office/word/2010/wordprocessingGroup" xmlns:wpi="http://schemas.microsoft.com/office/word/2010/wordprocessingInk" xmlns:wne="http://schemas.microsoft.com/office/word/2006/wordml" xmlns:wps="http://schemas.microsoft.com/office/word/2010/wordprocessingShape" mc:Ignorable="w14 w15 w16se w16cid w16 w16cex w16sdtdh w16sdtfl w16du wp14">
   <w:body>
+    <w:p>
+      <w:r>
+        <w:t>1. Identificación de Pares: Enumera tres claves (</w:t>
+      </w:r>
+      <w:proofErr w:type="spellStart"/>
+      <w:r>
+        <w:t>keys</w:t>
+      </w:r>
+      <w:proofErr w:type="spellEnd"/>
+      <w:r>
+        <w:t>) presentes en el nivel superior del objeto JSON.</w:t>
+      </w:r>
+    </w:p>
     <w:p/>
+    <w:p>
+      <w:pPr>
+        <w:rPr>
+          <w:lang w:val="en-US"/>
+        </w:rPr>
+      </w:pPr>
+      <w:r>
+        <w:rPr>
+          <w:lang w:val="en-US"/>
+        </w:rPr>
+        <w:t xml:space="preserve">Hostname, </w:t>
+      </w:r>
+      <w:proofErr w:type="spellStart"/>
+      <w:r>
+        <w:rPr>
+          <w:lang w:val="en-US"/>
+        </w:rPr>
+        <w:t>uptime_days</w:t>
+      </w:r>
+      <w:proofErr w:type="spellEnd"/>
+      <w:r>
+        <w:rPr>
+          <w:lang w:val="en-US"/>
+        </w:rPr>
+        <w:t xml:space="preserve">, </w:t>
+      </w:r>
+      <w:proofErr w:type="spellStart"/>
+      <w:r>
+        <w:rPr>
+          <w:lang w:val="en-US"/>
+        </w:rPr>
+        <w:t>managed_by_apic</w:t>
+      </w:r>
+      <w:proofErr w:type="spellEnd"/>
+    </w:p>
+    <w:p>
+      <w:pPr>
+        <w:rPr>
+          <w:lang w:val="en-US"/>
+        </w:rPr>
+      </w:pPr>
+    </w:p>
+    <w:p>
+      <w:r>
+        <w:t xml:space="preserve">2. Tipos de Datos: Identifica un ejemplo de cada uno de los siguientes tipos en el código: String, Number, </w:t>
+      </w:r>
+      <w:proofErr w:type="spellStart"/>
+      <w:r>
+        <w:t>Boolean</w:t>
+      </w:r>
+      <w:proofErr w:type="spellEnd"/>
+      <w:r>
+        <w:t xml:space="preserve"> y Null.</w:t>
+      </w:r>
+    </w:p>
+    <w:p/>
+    <w:p>
+      <w:pPr>
+        <w:rPr>
+          <w:lang w:val="en-US"/>
+        </w:rPr>
+      </w:pPr>
+      <w:r>
+        <w:rPr>
+          <w:lang w:val="en-US"/>
+        </w:rPr>
+        <w:t>R1-Core es String</w:t>
+      </w:r>
+    </w:p>
+    <w:p>
+      <w:pPr>
+        <w:rPr>
+          <w:lang w:val="en-US"/>
+        </w:rPr>
+      </w:pPr>
+    </w:p>
+    <w:p>
+      <w:pPr>
+        <w:rPr>
+          <w:lang w:val="en-US"/>
+        </w:rPr>
+      </w:pPr>
+      <w:proofErr w:type="spellStart"/>
+      <w:r>
+        <w:rPr>
+          <w:lang w:val="en-US"/>
+        </w:rPr>
+        <w:t>Uptime_days</w:t>
+      </w:r>
+      <w:proofErr w:type="spellEnd"/>
+      <w:r>
+        <w:rPr>
+          <w:lang w:val="en-US"/>
+        </w:rPr>
+        <w:t xml:space="preserve"> es Number</w:t>
+      </w:r>
+    </w:p>
+    <w:p>
+      <w:pPr>
+        <w:rPr>
+          <w:lang w:val="en-US"/>
+        </w:rPr>
+      </w:pPr>
+    </w:p>
+    <w:p>
+      <w:pPr>
+        <w:rPr>
+          <w:lang w:val="en-US"/>
+        </w:rPr>
+      </w:pPr>
+      <w:proofErr w:type="spellStart"/>
+      <w:r>
+        <w:rPr>
+          <w:lang w:val="en-US"/>
+        </w:rPr>
+        <w:t>managed_by_apic</w:t>
+      </w:r>
+      <w:proofErr w:type="spellEnd"/>
+      <w:r>
+        <w:rPr>
+          <w:lang w:val="en-US"/>
+        </w:rPr>
+        <w:t xml:space="preserve"> es Boolean</w:t>
+      </w:r>
+    </w:p>
+    <w:p>
+      <w:pPr>
+        <w:rPr>
+          <w:lang w:val="en-US"/>
+        </w:rPr>
+      </w:pPr>
+    </w:p>
+    <w:p>
+      <w:pPr>
+        <w:rPr>
+          <w:lang w:val="en-US"/>
+        </w:rPr>
+      </w:pPr>
+      <w:r>
+        <w:rPr>
+          <w:lang w:val="en-US"/>
+        </w:rPr>
+        <w:t xml:space="preserve">Interfaces es </w:t>
+      </w:r>
+      <w:proofErr w:type="spellStart"/>
+      <w:r>
+        <w:rPr>
+          <w:lang w:val="en-US"/>
+        </w:rPr>
+        <w:t>lista</w:t>
+      </w:r>
+      <w:proofErr w:type="spellEnd"/>
+    </w:p>
+    <w:p>
+      <w:pPr>
+        <w:rPr>
+          <w:lang w:val="en-US"/>
+        </w:rPr>
+      </w:pPr>
+    </w:p>
+    <w:p>
+      <w:proofErr w:type="spellStart"/>
+      <w:r>
+        <w:t>Description</w:t>
+      </w:r>
+      <w:proofErr w:type="spellEnd"/>
+      <w:r>
+        <w:t xml:space="preserve"> es Null</w:t>
+      </w:r>
+    </w:p>
+    <w:p>
+      <w:r>
+        <w:t>3. ¿Qué errores de sintaxis impiden que este JSON sea válido según los estándares de red y programación?</w:t>
+      </w:r>
+    </w:p>
+    <w:p>
+      <w:r>
+        <w:t>C) Existe una coma final (</w:t>
+      </w:r>
+      <w:proofErr w:type="spellStart"/>
+      <w:r>
+        <w:t>trailing</w:t>
+      </w:r>
+      <w:proofErr w:type="spellEnd"/>
+      <w:r>
+        <w:t xml:space="preserve"> </w:t>
+      </w:r>
+      <w:proofErr w:type="spellStart"/>
+      <w:r>
+        <w:t>comma</w:t>
+      </w:r>
+      <w:proofErr w:type="spellEnd"/>
+      <w:r>
+        <w:t>) después del valor de '</w:t>
+      </w:r>
+      <w:proofErr w:type="spellStart"/>
+      <w:r>
+        <w:t>description</w:t>
+      </w:r>
+      <w:proofErr w:type="spellEnd"/>
+      <w:r>
+        <w:t xml:space="preserve">'. </w:t>
+      </w:r>
+    </w:p>
+    <w:p>
+      <w:r>
+        <w:t>D) Faltan comas para separar los pares clave-valor después de '</w:t>
+      </w:r>
+      <w:proofErr w:type="spellStart"/>
+      <w:r>
+        <w:t>vlan_id</w:t>
+      </w:r>
+      <w:proofErr w:type="spellEnd"/>
+      <w:r>
+        <w:t>' y '</w:t>
+      </w:r>
+      <w:proofErr w:type="spellStart"/>
+      <w:r>
+        <w:t>name</w:t>
+      </w:r>
+      <w:proofErr w:type="spellEnd"/>
+      <w:r>
+        <w:t>'.</w:t>
+      </w:r>
+    </w:p>
+    <w:p/>
+    <w:p>
+      <w:r>
+        <w:t>4. Reflexión Técnica: Explica por qué es crítico que un controlador como Cisco DNA Center reciba un JSON perfectamente validado antes de aplicar cambios en la red.</w:t>
+      </w:r>
+    </w:p>
+    <w:p>
+      <w:pPr>
+        <w:rPr>
+          <w:rFonts w:asciiTheme="majorHAnsi" w:hAnsiTheme="majorHAnsi" w:cstheme="majorHAnsi"/>
+        </w:rPr>
+      </w:pPr>
+      <w:r>
+        <w:rPr>
+          <w:rFonts w:asciiTheme="majorHAnsi" w:hAnsiTheme="majorHAnsi" w:cstheme="majorHAnsi"/>
+        </w:rPr>
+        <w:t>Es importante validar correctamente el JSON porque contiene las instrucciones que Cisco DNA Center aplicará a la red. Un error puede provocar configuraciones incorrectas, pérdida de conectividad o interrupciones del servicio. La validación ayuda a prevenir estos problemas.</w:t>
+      </w:r>
+    </w:p>
+    <w:p>
+      <w:r>
+        <w:lastRenderedPageBreak/>
+        <w:t>Actividad 2.1</w:t>
+      </w:r>
+    </w:p>
+    <w:p>
+      <w:pPr>
+        <w:pStyle w:val="Prrafodelista"/>
+        <w:numPr>
+          <w:ilvl w:val="0"/>
+          <w:numId w:val="1"/>
+        </w:numPr>
+      </w:pPr>
+      <w:r>
+        <w:t xml:space="preserve">Escribe el pseudocódigo o completa el script de Python necesario para procesar la variable </w:t>
+      </w:r>
+      <w:proofErr w:type="spellStart"/>
+      <w:r>
+        <w:t>inventario_json</w:t>
+      </w:r>
+      <w:proofErr w:type="spellEnd"/>
+      <w:r>
+        <w:t xml:space="preserve"> (que contiene el texto anterior). El script debe filtrar e imprimir únicamente los </w:t>
+      </w:r>
+      <w:proofErr w:type="spellStart"/>
+      <w:r>
+        <w:t>hostnames</w:t>
+      </w:r>
+      <w:proofErr w:type="spellEnd"/>
+      <w:r>
+        <w:t xml:space="preserve"> de los dispositivos cuyo estado sea '</w:t>
+      </w:r>
+      <w:proofErr w:type="spellStart"/>
+      <w:r>
+        <w:t>down</w:t>
+      </w:r>
+      <w:proofErr w:type="spellEnd"/>
+      <w:r>
+        <w:t>'</w:t>
+      </w:r>
+    </w:p>
+    <w:p>
+      <w:pPr>
+        <w:ind w:left="360"/>
+      </w:pPr>
+      <w:r>
+        <w:t xml:space="preserve">#imprimir todos los </w:t>
+      </w:r>
+      <w:proofErr w:type="spellStart"/>
+      <w:r>
+        <w:t>hostname</w:t>
+      </w:r>
+      <w:proofErr w:type="spellEnd"/>
+    </w:p>
+    <w:p>
+      <w:pPr>
+        <w:ind w:left="360"/>
+      </w:pPr>
+      <w:proofErr w:type="spellStart"/>
+      <w:r>
+        <w:t>for</w:t>
+      </w:r>
+      <w:proofErr w:type="spellEnd"/>
+      <w:r>
+        <w:t xml:space="preserve"> h in inventario:</w:t>
+      </w:r>
+    </w:p>
+    <w:p>
+      <w:pPr>
+        <w:ind w:left="360"/>
+      </w:pPr>
+      <w:r>
+        <w:tab/>
+      </w:r>
+      <w:proofErr w:type="spellStart"/>
+      <w:r>
+        <w:t>prin</w:t>
+      </w:r>
+      <w:proofErr w:type="spellEnd"/>
+      <w:r>
+        <w:t>(h["</w:t>
+      </w:r>
+      <w:proofErr w:type="spellStart"/>
+      <w:r>
+        <w:t>hostname</w:t>
+      </w:r>
+      <w:proofErr w:type="spellEnd"/>
+      <w:r>
+        <w:t>"])</w:t>
+      </w:r>
+    </w:p>
+    <w:p>
+      <w:pPr>
+        <w:ind w:left="360"/>
+      </w:pPr>
+      <w:r>
+        <w:t xml:space="preserve">#imprimir todos las </w:t>
+      </w:r>
+      <w:proofErr w:type="spellStart"/>
+      <w:r>
+        <w:t>ips</w:t>
+      </w:r>
+      <w:proofErr w:type="spellEnd"/>
+    </w:p>
+    <w:p>
+      <w:pPr>
+        <w:ind w:left="360"/>
+        <w:rPr>
+          <w:lang w:val="en-US"/>
+        </w:rPr>
+      </w:pPr>
+      <w:r>
+        <w:rPr>
+          <w:lang w:val="en-US"/>
+        </w:rPr>
+        <w:t xml:space="preserve">for x in </w:t>
+      </w:r>
+      <w:proofErr w:type="spellStart"/>
+      <w:r>
+        <w:rPr>
+          <w:lang w:val="en-US"/>
+        </w:rPr>
+        <w:t>inventario</w:t>
+      </w:r>
+      <w:proofErr w:type="spellEnd"/>
+      <w:r>
+        <w:rPr>
+          <w:lang w:val="en-US"/>
+        </w:rPr>
+        <w:t>:</w:t>
+      </w:r>
+    </w:p>
+    <w:p>
+      <w:pPr>
+        <w:ind w:left="360"/>
+        <w:rPr>
+          <w:lang w:val="en-US"/>
+        </w:rPr>
+      </w:pPr>
+      <w:r>
+        <w:rPr>
+          <w:lang w:val="en-US"/>
+        </w:rPr>
+        <w:tab/>
+        <w:t>print(x["</w:t>
+      </w:r>
+      <w:proofErr w:type="spellStart"/>
+      <w:r>
+        <w:rPr>
+          <w:lang w:val="en-US"/>
+        </w:rPr>
+        <w:t>ip</w:t>
+      </w:r>
+      <w:proofErr w:type="spellEnd"/>
+      <w:r>
+        <w:rPr>
+          <w:lang w:val="en-US"/>
+        </w:rPr>
+        <w:t>"])</w:t>
+      </w:r>
+    </w:p>
+    <w:p>
+      <w:pPr>
+        <w:ind w:left="360"/>
+      </w:pPr>
+      <w:r>
+        <w:t xml:space="preserve">#imprimir todos los que </w:t>
+      </w:r>
+      <w:proofErr w:type="spellStart"/>
+      <w:r>
+        <w:t>esten</w:t>
+      </w:r>
+      <w:proofErr w:type="spellEnd"/>
+      <w:r>
+        <w:t xml:space="preserve"> en </w:t>
+      </w:r>
+      <w:proofErr w:type="spellStart"/>
+      <w:r>
+        <w:t>down</w:t>
+      </w:r>
+      <w:proofErr w:type="spellEnd"/>
+    </w:p>
+    <w:p>
+      <w:pPr>
+        <w:ind w:left="360"/>
+        <w:rPr>
+          <w:lang w:val="en-US"/>
+        </w:rPr>
+      </w:pPr>
+      <w:r>
+        <w:rPr>
+          <w:lang w:val="en-US"/>
+        </w:rPr>
+        <w:t>for v in range:</w:t>
+      </w:r>
+    </w:p>
+    <w:p>
+      <w:pPr>
+        <w:ind w:left="360"/>
+        <w:rPr>
+          <w:lang w:val="en-US"/>
+        </w:rPr>
+      </w:pPr>
+      <w:r>
+        <w:rPr>
+          <w:lang w:val="en-US"/>
+        </w:rPr>
+        <w:tab/>
+        <w:t>if v ["status</w:t>
+      </w:r>
+      <w:proofErr w:type="gramStart"/>
+      <w:r>
+        <w:rPr>
+          <w:lang w:val="en-US"/>
+        </w:rPr>
+        <w:t>"]=</w:t>
+      </w:r>
+      <w:proofErr w:type="gramEnd"/>
+      <w:r>
+        <w:rPr>
+          <w:lang w:val="en-US"/>
+        </w:rPr>
+        <w:t>="down":</w:t>
+      </w:r>
+    </w:p>
+    <w:p>
+      <w:pPr>
+        <w:ind w:left="360"/>
+      </w:pPr>
+      <w:r>
+        <w:rPr>
+          <w:lang w:val="en-US"/>
+        </w:rPr>
+        <w:tab/>
+      </w:r>
+      <w:r>
+        <w:rPr>
+          <w:lang w:val="en-US"/>
+        </w:rPr>
+        <w:tab/>
+      </w:r>
+      <w:proofErr w:type="spellStart"/>
+      <w:r>
+        <w:t>print</w:t>
+      </w:r>
+      <w:proofErr w:type="spellEnd"/>
+      <w:r>
+        <w:t>(v["</w:t>
+      </w:r>
+      <w:proofErr w:type="spellStart"/>
+      <w:r>
+        <w:t>hostname</w:t>
+      </w:r>
+      <w:proofErr w:type="spellEnd"/>
+      <w:r>
+        <w:t>"])</w:t>
+      </w:r>
+    </w:p>
+    <w:p>
+      <w:pPr>
+        <w:ind w:left="360"/>
+      </w:pPr>
+    </w:p>
+    <w:p>
+      <w:pPr>
+        <w:ind w:left="360"/>
+      </w:pPr>
+      <w:r>
+        <w:t xml:space="preserve"> </w:t>
+      </w:r>
+      <w:r>
+        <w:drawing>
+          <wp:inline distT="0" distB="0" distL="0" distR="0" wp14:anchorId="6A247131" wp14:editId="07170F2D">
+            <wp:extent cx="5612130" cy="2209165"/>
+            <wp:effectExtent l="0" t="0" r="7620" b="635"/>
+            <wp:docPr id="1729009867" name="Imagen 1"/>
+            <wp:cNvGraphicFramePr>
+              <a:graphicFrameLocks xmlns:a="http://schemas.openxmlformats.org/drawingml/2006/main" noChangeAspect="1"/>
+            </wp:cNvGraphicFramePr>
+            <a:graphic xmlns:a="http://schemas.openxmlformats.org/drawingml/2006/main">
+              <a:graphicData uri="http://schemas.openxmlformats.org/drawingml/2006/picture">
+                <pic:pic xmlns:pic="http://schemas.openxmlformats.org/drawingml/2006/picture">
+                  <pic:nvPicPr>
+                    <pic:cNvPr id="1729009867" name=""/>
+                    <pic:cNvPicPr/>
+                  </pic:nvPicPr>
+                  <pic:blipFill>
+                    <a:blip r:embed="rId5"/>
+                    <a:stretch>
+                      <a:fillRect/>
+                    </a:stretch>
+                  </pic:blipFill>
+                  <pic:spPr>
+                    <a:xfrm>
+                      <a:off x="0" y="0"/>
+                      <a:ext cx="5612130" cy="2209165"/>
+                    </a:xfrm>
+                    <a:prstGeom prst="rect">
+                      <a:avLst/>
+                    </a:prstGeom>
+                  </pic:spPr>
+                </pic:pic>
+              </a:graphicData>
+            </a:graphic>
+          </wp:inline>
+        </w:drawing>
+      </w:r>
+    </w:p>
+    <w:p>
+      <w:pPr>
+        <w:ind w:left="360"/>
+      </w:pPr>
+    </w:p>
+    <w:p>
+      <w:pPr>
+        <w:ind w:left="360"/>
+      </w:pPr>
+    </w:p>
+    <w:p>
+      <w:pPr>
+        <w:ind w:left="360"/>
+      </w:pPr>
+    </w:p>
+    <w:p>
+      <w:pPr>
+        <w:ind w:left="360"/>
+      </w:pPr>
+    </w:p>
+    <w:tbl>
+      <w:tblPr>
+        <w:tblW w:w="0" w:type="auto"/>
+        <w:tblCellSpacing w:w="15" w:type="dxa"/>
+        <w:tblBorders>
+          <w:top w:val="single" w:sz="4" w:space="0" w:color="auto"/>
+          <w:left w:val="single" w:sz="4" w:space="0" w:color="auto"/>
+          <w:bottom w:val="single" w:sz="4" w:space="0" w:color="auto"/>
+          <w:right w:val="single" w:sz="4" w:space="0" w:color="auto"/>
+          <w:insideH w:val="single" w:sz="4" w:space="0" w:color="auto"/>
+          <w:insideV w:val="single" w:sz="4" w:space="0" w:color="auto"/>
+        </w:tblBorders>
+        <w:tblCellMar>
+          <w:top w:w="15" w:type="dxa"/>
+          <w:left w:w="15" w:type="dxa"/>
+          <w:bottom w:w="15" w:type="dxa"/>
+          <w:right w:w="15" w:type="dxa"/>
+        </w:tblCellMar>
+        <w:tblLook w:val="04A0" w:firstRow="1" w:lastRow="0" w:firstColumn="1" w:lastColumn="0" w:noHBand="0" w:noVBand="1"/>
+      </w:tblPr>
+      <w:tblGrid>
+        <w:gridCol w:w="1796"/>
+        <w:gridCol w:w="2883"/>
+        <w:gridCol w:w="2287"/>
+      </w:tblGrid>
+      <w:tr>
+        <w:trPr>
+          <w:tblHeader/>
+          <w:tblCellSpacing w:w="15" w:type="dxa"/>
+        </w:trPr>
+        <w:tc>
+          <w:tcPr>
+            <w:tcW w:w="0" w:type="auto"/>
+            <w:vAlign w:val="center"/>
+            <w:hideMark/>
+          </w:tcPr>
+          <w:p>
+            <w:pPr>
+              <w:ind w:left="360"/>
+              <w:rPr>
+                <w:b/>
+                <w:bCs/>
+              </w:rPr>
+            </w:pPr>
+            <w:r>
+              <w:rPr>
+                <w:b/>
+                <w:bCs/>
+              </w:rPr>
+              <w:lastRenderedPageBreak/>
+              <w:t>Característica</w:t>
+            </w:r>
+          </w:p>
+        </w:tc>
+        <w:tc>
+          <w:tcPr>
+            <w:tcW w:w="0" w:type="auto"/>
+            <w:vAlign w:val="center"/>
+            <w:hideMark/>
+          </w:tcPr>
+          <w:p>
+            <w:pPr>
+              <w:ind w:left="360"/>
+              <w:rPr>
+                <w:b/>
+                <w:bCs/>
+              </w:rPr>
+            </w:pPr>
+            <w:r>
+              <w:rPr>
+                <w:b/>
+                <w:bCs/>
+              </w:rPr>
+              <w:t>JSON</w:t>
+            </w:r>
+          </w:p>
+        </w:tc>
+        <w:tc>
+          <w:tcPr>
+            <w:tcW w:w="0" w:type="auto"/>
+            <w:vAlign w:val="center"/>
+            <w:hideMark/>
+          </w:tcPr>
+          <w:p>
+            <w:pPr>
+              <w:ind w:left="360"/>
+              <w:rPr>
+                <w:b/>
+                <w:bCs/>
+              </w:rPr>
+            </w:pPr>
+            <w:r>
+              <w:rPr>
+                <w:b/>
+                <w:bCs/>
+              </w:rPr>
+              <w:t>XML</w:t>
+            </w:r>
+          </w:p>
+        </w:tc>
+      </w:tr>
+      <w:tr>
+        <w:trPr>
+          <w:tblCellSpacing w:w="15" w:type="dxa"/>
+        </w:trPr>
+        <w:tc>
+          <w:tcPr>
+            <w:tcW w:w="0" w:type="auto"/>
+            <w:vAlign w:val="center"/>
+            <w:hideMark/>
+          </w:tcPr>
+          <w:p>
+            <w:pPr>
+              <w:ind w:left="360"/>
+            </w:pPr>
+            <w:r>
+              <w:t>Estructura</w:t>
+            </w:r>
+          </w:p>
+        </w:tc>
+        <w:tc>
+          <w:tcPr>
+            <w:tcW w:w="0" w:type="auto"/>
+            <w:vAlign w:val="center"/>
+            <w:hideMark/>
+          </w:tcPr>
+          <w:p>
+            <w:pPr>
+              <w:ind w:left="360"/>
+            </w:pPr>
+            <w:r>
+              <w:t>Llaves y pares clave-valor</w:t>
+            </w:r>
+          </w:p>
+        </w:tc>
+        <w:tc>
+          <w:tcPr>
+            <w:tcW w:w="0" w:type="auto"/>
+            <w:vAlign w:val="center"/>
+            <w:hideMark/>
+          </w:tcPr>
+          <w:p>
+            <w:pPr>
+              <w:ind w:left="360"/>
+            </w:pPr>
+            <w:r>
+              <w:t>Etiquetas</w:t>
+            </w:r>
+          </w:p>
+        </w:tc>
+      </w:tr>
+      <w:tr>
+        <w:trPr>
+          <w:tblCellSpacing w:w="15" w:type="dxa"/>
+        </w:trPr>
+        <w:tc>
+          <w:tcPr>
+            <w:tcW w:w="0" w:type="auto"/>
+            <w:vAlign w:val="center"/>
+            <w:hideMark/>
+          </w:tcPr>
+          <w:p>
+            <w:pPr>
+              <w:ind w:left="360"/>
+            </w:pPr>
+            <w:r>
+              <w:t>Legibilidad</w:t>
+            </w:r>
+          </w:p>
+        </w:tc>
+        <w:tc>
+          <w:tcPr>
+            <w:tcW w:w="0" w:type="auto"/>
+            <w:vAlign w:val="center"/>
+            <w:hideMark/>
+          </w:tcPr>
+          <w:p>
+            <w:pPr>
+              <w:ind w:left="360"/>
+            </w:pPr>
+            <w:r>
+              <w:t>Simple y compacta</w:t>
+            </w:r>
+          </w:p>
+        </w:tc>
+        <w:tc>
+          <w:tcPr>
+            <w:tcW w:w="0" w:type="auto"/>
+            <w:vAlign w:val="center"/>
+            <w:hideMark/>
+          </w:tcPr>
+          <w:p>
+            <w:pPr>
+              <w:ind w:left="360"/>
+            </w:pPr>
+            <w:r>
+              <w:t>Más extensa</w:t>
+            </w:r>
+          </w:p>
+        </w:tc>
+      </w:tr>
+      <w:tr>
+        <w:trPr>
+          <w:tblCellSpacing w:w="15" w:type="dxa"/>
+        </w:trPr>
+        <w:tc>
+          <w:tcPr>
+            <w:tcW w:w="0" w:type="auto"/>
+            <w:vAlign w:val="center"/>
+            <w:hideMark/>
+          </w:tcPr>
+          <w:p>
+            <w:pPr>
+              <w:ind w:left="360"/>
+            </w:pPr>
+            <w:r>
+              <w:t>Sintaxis</w:t>
+            </w:r>
+          </w:p>
+        </w:tc>
+        <w:tc>
+          <w:tcPr>
+            <w:tcW w:w="0" w:type="auto"/>
+            <w:vAlign w:val="center"/>
+            <w:hideMark/>
+          </w:tcPr>
+          <w:p>
+            <w:pPr>
+              <w:ind w:left="360"/>
+            </w:pPr>
+            <w:r>
+              <w:t>{ }</w:t>
+            </w:r>
+          </w:p>
+        </w:tc>
+        <w:tc>
+          <w:tcPr>
+            <w:tcW w:w="0" w:type="auto"/>
+            <w:vAlign w:val="center"/>
+            <w:hideMark/>
+          </w:tcPr>
+          <w:p>
+            <w:pPr>
+              <w:ind w:left="360"/>
+            </w:pPr>
+            <w:r>
+              <w:t>&lt; &gt;</w:t>
+            </w:r>
+          </w:p>
+        </w:tc>
+      </w:tr>
+      <w:tr>
+        <w:trPr>
+          <w:tblCellSpacing w:w="15" w:type="dxa"/>
+        </w:trPr>
+        <w:tc>
+          <w:tcPr>
+            <w:tcW w:w="0" w:type="auto"/>
+            <w:vAlign w:val="center"/>
+            <w:hideMark/>
+          </w:tcPr>
+          <w:p>
+            <w:pPr>
+              <w:ind w:left="360"/>
+            </w:pPr>
+            <w:r>
+              <w:t>Datos</w:t>
+            </w:r>
+          </w:p>
+        </w:tc>
+        <w:tc>
+          <w:tcPr>
+            <w:tcW w:w="0" w:type="auto"/>
+            <w:vAlign w:val="center"/>
+            <w:hideMark/>
+          </w:tcPr>
+          <w:p>
+            <w:pPr>
+              <w:ind w:left="360"/>
+            </w:pPr>
+            <w:r>
+              <w:t>Clave-valor</w:t>
+            </w:r>
+          </w:p>
+        </w:tc>
+        <w:tc>
+          <w:tcPr>
+            <w:tcW w:w="0" w:type="auto"/>
+            <w:vAlign w:val="center"/>
+            <w:hideMark/>
+          </w:tcPr>
+          <w:p>
+            <w:pPr>
+              <w:ind w:left="360"/>
+            </w:pPr>
+            <w:r>
+              <w:t>Etiquetas anidadas</w:t>
+            </w:r>
+          </w:p>
+        </w:tc>
+      </w:tr>
+      <w:tr>
+        <w:trPr>
+          <w:tblCellSpacing w:w="15" w:type="dxa"/>
+        </w:trPr>
+        <w:tc>
+          <w:tcPr>
+            <w:tcW w:w="0" w:type="auto"/>
+            <w:vAlign w:val="center"/>
+            <w:hideMark/>
+          </w:tcPr>
+          <w:p>
+            <w:pPr>
+              <w:ind w:left="360"/>
+            </w:pPr>
+            <w:r>
+              <w:t>Extensión</w:t>
+            </w:r>
+          </w:p>
+        </w:tc>
+        <w:tc>
+          <w:tcPr>
+            <w:tcW w:w="0" w:type="auto"/>
+            <w:vAlign w:val="center"/>
+            <w:hideMark/>
+          </w:tcPr>
+          <w:p>
+            <w:pPr>
+              <w:ind w:left="360"/>
+            </w:pPr>
+            <w:r>
+              <w:t>Menor</w:t>
+            </w:r>
+          </w:p>
+        </w:tc>
+        <w:tc>
+          <w:tcPr>
+            <w:tcW w:w="0" w:type="auto"/>
+            <w:vAlign w:val="center"/>
+            <w:hideMark/>
+          </w:tcPr>
+          <w:p>
+            <w:pPr>
+              <w:ind w:left="360"/>
+            </w:pPr>
+            <w:r>
+              <w:t>Mayor</w:t>
+            </w:r>
+          </w:p>
+        </w:tc>
+      </w:tr>
+    </w:tbl>
+    <w:p>
+      <w:pPr>
+        <w:ind w:left="360"/>
+      </w:pPr>
+    </w:p>
     <w:sectPr>
       <w:pgSz w:w="12240" w:h="15840"/>
       <w:pgMar w:top="1417" w:right="1701" w:bottom="1417" w:left="1701" w:header="708" w:footer="708" w:gutter="0"/>
@@ -11,6 +954,103 @@
     </w:sectPr>
   </w:body>
 </w:document>
+</file>
+
+<file path=word/numbering.xml><?xml version="1.0" encoding="utf-8"?>
+<w:numbering xmlns:wpc="http://schemas.microsoft.com/office/word/2010/wordprocessingCanvas" xmlns:cx="http://schemas.microsoft.com/office/drawing/2014/chartex" xmlns:cx1="http://schemas.microsoft.com/office/drawing/2015/9/8/chartex" xmlns:cx2="http://schemas.microsoft.com/office/drawing/2015/10/21/chartex" xmlns:cx3="http://schemas.microsoft.com/office/drawing/2016/5/9/chartex" xmlns:cx4="http://schemas.microsoft.com/office/drawing/2016/5/10/chartex" xmlns:cx5="http://schemas.microsoft.com/office/drawing/2016/5/11/chartex" xmlns:cx6="http://schemas.microsoft.com/office/drawing/2016/5/12/chartex" xmlns:cx7="http://schemas.microsoft.com/office/drawing/2016/5/13/chartex" xmlns:cx8="http://schemas.microsoft.com/office/drawing/2016/5/14/chartex" xmlns:mc="http://schemas.openxmlformats.org/markup-compatibility/2006" xmlns:aink="http://schemas.microsoft.com/office/drawing/2016/ink" xmlns:am3d="http://schemas.microsoft.com/office/drawing/2017/model3d" xmlns:o="urn:schemas-microsoft-com:office:office" xmlns:oel="http://schemas.microsoft.com/office/2019/extlst" xmlns:r="http://schemas.openxmlformats.org/officeDocument/2006/relationships" xmlns:m="http://schemas.openxmlformats.org/officeDocument/2006/math" xmlns:v="urn:schemas-microsoft-com:vml" xmlns:wp14="http://schemas.microsoft.com/office/word/2010/wordprocessingDrawing" xmlns:wp="http://schemas.openxmlformats.org/drawingml/2006/wordprocessingDrawing" xmlns:w10="urn:schemas-microsoft-com:office:word" xmlns:w="http://schemas.openxmlformats.org/wordprocessingml/2006/main" xmlns:w14="http://schemas.microsoft.com/office/word/2010/wordml" xmlns:w15="http://schemas.microsoft.com/office/word/2012/wordml" xmlns:w16cex="http://schemas.microsoft.com/office/word/2018/wordml/cex" xmlns:w16cid="http://schemas.microsoft.com/office/word/2016/wordml/cid" xmlns:w16="http://schemas.microsoft.com/office/word/2018/wordml" xmlns:w16du="http://schemas.microsoft.com/office/word/2023/wordml/word16du" xmlns:w16sdtdh="http://schemas.microsoft.com/office/word/2020/wordml/sdtdatahash" xmlns:w16sdtfl="http://schemas.microsoft.com/office/word/2024/wordml/sdtformatlock" xmlns:w16se="http://schemas.microsoft.com/office/word/2015/wordml/symex" xmlns:wpg="http://schemas.microsoft.com/office/word/2010/wordprocessingGroup" xmlns:wpi="http://schemas.microsoft.com/office/word/2010/wordprocessingInk" xmlns:wne="http://schemas.microsoft.com/office/word/2006/wordml" xmlns:wps="http://schemas.microsoft.com/office/word/2010/wordprocessingShape" mc:Ignorable="w14 w15 w16se w16cid w16 w16cex w16sdtdh w16sdtfl w16du wp14">
+  <w:abstractNum w:abstractNumId="0" w15:restartNumberingAfterBreak="0">
+    <w:nsid w:val="77901633"/>
+    <w:multiLevelType w:val="hybridMultilevel"/>
+    <w:tmpl w:val="6F40597A"/>
+    <w:lvl w:ilvl="0" w:tplc="080A000F">
+      <w:start w:val="1"/>
+      <w:numFmt w:val="decimal"/>
+      <w:lvlText w:val="%1."/>
+      <w:lvlJc w:val="left"/>
+      <w:pPr>
+        <w:ind w:left="720" w:hanging="360"/>
+      </w:pPr>
+      <w:rPr>
+        <w:rFonts w:hint="default"/>
+      </w:rPr>
+    </w:lvl>
+    <w:lvl w:ilvl="1" w:tplc="080A0019" w:tentative="1">
+      <w:start w:val="1"/>
+      <w:numFmt w:val="lowerLetter"/>
+      <w:lvlText w:val="%2."/>
+      <w:lvlJc w:val="left"/>
+      <w:pPr>
+        <w:ind w:left="1440" w:hanging="360"/>
+      </w:pPr>
+    </w:lvl>
+    <w:lvl w:ilvl="2" w:tplc="080A001B" w:tentative="1">
+      <w:start w:val="1"/>
+      <w:numFmt w:val="lowerRoman"/>
+      <w:lvlText w:val="%3."/>
+      <w:lvlJc w:val="right"/>
+      <w:pPr>
+        <w:ind w:left="2160" w:hanging="180"/>
+      </w:pPr>
+    </w:lvl>
+    <w:lvl w:ilvl="3" w:tplc="080A000F" w:tentative="1">
+      <w:start w:val="1"/>
+      <w:numFmt w:val="decimal"/>
+      <w:lvlText w:val="%4."/>
+      <w:lvlJc w:val="left"/>
+      <w:pPr>
+        <w:ind w:left="2880" w:hanging="360"/>
+      </w:pPr>
+    </w:lvl>
+    <w:lvl w:ilvl="4" w:tplc="080A0019" w:tentative="1">
+      <w:start w:val="1"/>
+      <w:numFmt w:val="lowerLetter"/>
+      <w:lvlText w:val="%5."/>
+      <w:lvlJc w:val="left"/>
+      <w:pPr>
+        <w:ind w:left="3600" w:hanging="360"/>
+      </w:pPr>
+    </w:lvl>
+    <w:lvl w:ilvl="5" w:tplc="080A001B" w:tentative="1">
+      <w:start w:val="1"/>
+      <w:numFmt w:val="lowerRoman"/>
+      <w:lvlText w:val="%6."/>
+      <w:lvlJc w:val="right"/>
+      <w:pPr>
+        <w:ind w:left="4320" w:hanging="180"/>
+      </w:pPr>
+    </w:lvl>
+    <w:lvl w:ilvl="6" w:tplc="080A000F" w:tentative="1">
+      <w:start w:val="1"/>
+      <w:numFmt w:val="decimal"/>
+      <w:lvlText w:val="%7."/>
+      <w:lvlJc w:val="left"/>
+      <w:pPr>
+        <w:ind w:left="5040" w:hanging="360"/>
+      </w:pPr>
+    </w:lvl>
+    <w:lvl w:ilvl="7" w:tplc="080A0019" w:tentative="1">
+      <w:start w:val="1"/>
+      <w:numFmt w:val="lowerLetter"/>
+      <w:lvlText w:val="%8."/>
+      <w:lvlJc w:val="left"/>
+      <w:pPr>
+        <w:ind w:left="5760" w:hanging="360"/>
+      </w:pPr>
+    </w:lvl>
+    <w:lvl w:ilvl="8" w:tplc="080A001B" w:tentative="1">
+      <w:start w:val="1"/>
+      <w:numFmt w:val="lowerRoman"/>
+      <w:lvlText w:val="%9."/>
+      <w:lvlJc w:val="right"/>
+      <w:pPr>
+        <w:ind w:left="6480" w:hanging="180"/>
+      </w:pPr>
+    </w:lvl>
+  </w:abstractNum>
+  <w:num w:numId="1" w16cid:durableId="1903707892">
+    <w:abstractNumId w:val="0"/>
+  </w:num>
+</w:numbering>
 </file>
 
 <file path=word/styles.xml><?xml version="1.0" encoding="utf-8"?>
@@ -616,7 +1656,6 @@
   <w:style w:type="character" w:default="1" w:styleId="Fuentedeprrafopredeter">
     <w:name w:val="Default Paragraph Font"/>
     <w:uiPriority w:val="1"/>
-    <w:semiHidden/>
     <w:unhideWhenUsed/>
   </w:style>
   <w:style w:type="table" w:default="1" w:styleId="Tablanormal">

</xml_diff>